<commit_message>
Make rat protein pipeline portable for teammates
</commit_message>
<xml_diff>
--- a/MoTrPAC Hackathon/Rat Comparison PAH Proteins/Rat Comparison PAH Proteins Guide.docx
+++ b/MoTrPAC Hackathon/Rat Comparison PAH Proteins/Rat Comparison PAH Proteins Guide.docx
@@ -70,7 +70,7 @@
           <w:b w:val="0"/>
           <w:i w:val="0"/>
         </w:rPr>
-        <w:t xml:space="preserve"> is a transcription of its nine rows. Check it against page 5 of Malenfant2015.pdf. “Ratio PAH/Ctrl” compares abundance in resting PAH muscle with healthy controls. For example, NDUFA9’s ratio of </w:t>
+        <w:t xml:space="preserve"> is a transcription of its nine rows. Check Table 2 through the article DOI; the publisher PDF is optional and not bundled. “Ratio PAH/Ctrl” compares abundance in resting PAH muscle with healthy controls. For example, NDUFA9’s ratio of </w:t>
       </w:r>
       <w:r>
         <w:rPr>
@@ -165,7 +165,7 @@
           <w:b w:val="0"/>
           <w:i w:val="0"/>
         </w:rPr>
-        <w:t>00_verify_inputs.ps1 checks the nine PAH/control ratios and the hashes of all rat files. A failed hash stops the pipeline before an altered input can affect the result.</w:t>
+        <w:t>run_all.py --verify-only (or Windows 00_verify_inputs.ps1) checks the nine PAH/control ratios and the hashes of all rat files. A failed hash stops the pipeline before an altered input can affect the result.</w:t>
       </w:r>
     </w:p>
     <w:p>
@@ -314,7 +314,7 @@
           <w:b w:val="0"/>
           <w:i w:val="0"/>
         </w:rPr>
-        <w:t>In PowerShell, run scripts/run_all.ps1 from this folder. It verifies the copied inputs and runs 01 through 05 in order. The README.md gives a full copy-and-paste command, commands for running one script at a time, and a list of every output. R 4.4.2 and base R are sufficient.</w:t>
+        <w:t>From a fresh clone, change into this module folder and run python scripts/run_all.py. It verifies the bundled inputs and runs 01 through 05 in order. Python 3.10 or newer and R 4.4 or newer are sufficient; no extra packages are needed. README.md gives commands for each script and a Windows PowerShell alternative.</w:t>
       </w:r>
     </w:p>
     <w:p>

</xml_diff>